<commit_message>
Rebuild request plan around advisor guidance and forest management plan fields
Co-Authored-By: Claude Opus 5.5 <noreply@anthropic.com>
Claude-Session: https://claude.ai/code/session_011DrJSR3zzQAfuEGwbEcRfw
</commit_message>
<xml_diff>
--- a/reports/2026-10_정보공개청구_검토안.docx
+++ b/reports/2026-10_정보공개청구_검토안.docx
@@ -119,7 +119,93 @@
           <w:b w:val="false"/>
           <w:bCs w:val="false"/>
         </w:rPr>
-        <w:t xml:space="preserve">1. 청구 대상: 동부·북부지방산림청</w:t>
+        <w:t xml:space="preserve">1. 사례지 선정 원칙(자문 반영)</w:t>
+      </w:r>
+    </w:p>
+    <w:p>
+      <w:pPr>
+        <w:pBdr>
+          <w:top w:val="dashed" w:color="BFC6BC" w:sz="4" w:space="4"/>
+          <w:bottom w:val="dashed" w:color="BFC6BC" w:sz="4" w:space="4"/>
+        </w:pBdr>
+        <w:shd w:fill="F1F3EE" w:color="auto" w:val="clear"/>
+        <w:spacing w:after="120" w:before="80"/>
+        <w:jc w:val="center"/>
+      </w:pPr>
+      <w:r>
+        <w:rPr>
+          <w:rFonts w:ascii="Malgun Gothic" w:cs="Malgun Gothic" w:eastAsia="맑은 고딕" w:hAnsi="Malgun Gothic"/>
+          <w:b w:val="false"/>
+          <w:bCs w:val="false"/>
+        </w:rPr>
+        <w:t xml:space="preserve">벌채 실적 多 → 임도 개설 多 → 토사유출·산사태 多 → 산지사방사업 시행</w:t>
+      </w:r>
+    </w:p>
+    <w:p>
+      <w:pPr>
+        <w:pStyle w:val="ListParagraph"/>
+        <w:numPr>
+          <w:ilvl w:val="0"/>
+          <w:numId w:val="2"/>
+        </w:numPr>
+        <w:spacing w:after="60"/>
+      </w:pPr>
+      <w:r>
+        <w:rPr>
+          <w:rFonts w:ascii="Malgun Gothic" w:cs="Malgun Gothic" w:eastAsia="맑은 고딕" w:hAnsi="Malgun Gothic"/>
+          <w:b w:val="false"/>
+          <w:bCs w:val="false"/>
+        </w:rPr>
+        <w:t xml:space="preserve">벌채 실적을 먼저 관찰하고, 이를 토대로 사례분석지역을 정함.</w:t>
+      </w:r>
+    </w:p>
+    <w:p>
+      <w:pPr>
+        <w:pStyle w:val="ListParagraph"/>
+        <w:numPr>
+          <w:ilvl w:val="0"/>
+          <w:numId w:val="2"/>
+        </w:numPr>
+        <w:spacing w:after="60"/>
+      </w:pPr>
+      <w:r>
+        <w:rPr>
+          <w:rFonts w:ascii="Malgun Gothic" w:cs="Malgun Gothic" w:eastAsia="맑은 고딕" w:hAnsi="Malgun Gothic"/>
+          <w:b w:val="false"/>
+          <w:bCs w:val="false"/>
+        </w:rPr>
+        <w:t xml:space="preserve">국유림별로 벌채 실적이 많은 국유림(관리소)을 선택함.</w:t>
+      </w:r>
+    </w:p>
+    <w:p>
+      <w:pPr>
+        <w:pStyle w:val="ListParagraph"/>
+        <w:numPr>
+          <w:ilvl w:val="0"/>
+          <w:numId w:val="2"/>
+        </w:numPr>
+        <w:spacing w:after="60"/>
+      </w:pPr>
+      <w:r>
+        <w:rPr>
+          <w:rFonts w:ascii="Malgun Gothic" w:cs="Malgun Gothic" w:eastAsia="맑은 고딕" w:hAnsi="Malgun Gothic"/>
+          <w:b w:val="false"/>
+          <w:bCs w:val="false"/>
+        </w:rPr>
+        <w:t xml:space="preserve">산림경영정보시스템에서 얻을 수 있는 정보를 먼저 파악하고, 이를 기준으로 요청 정보의 사양을 정리해 청구함.</w:t>
+      </w:r>
+    </w:p>
+    <w:p>
+      <w:pPr>
+        <w:pStyle w:val="Heading1"/>
+      </w:pPr>
+      <w:r>
+        <w:rPr>
+          <w:rFonts w:ascii="Malgun Gothic" w:cs="Malgun Gothic" w:eastAsia="맑은 고딕" w:hAnsi="Malgun Gothic"/>
+          <w:b w:val="false"/>
+          <w:bCs w:val="false"/>
+        </w:rPr>
+        <w:t xml:space="preserve">2. 청구 대상: 동부·북부지방산림청</w:t>
       </w:r>
     </w:p>
     <w:tbl>
@@ -565,7 +651,7 @@
           <w:sz w:val="18"/>
           <w:szCs w:val="18"/>
         </w:rPr>
-        <w:t xml:space="preserve">자료: 산림청 『임업통계연보』 국유림 목재매각실적. 동부·북부는 5년 모두 1·2위. 동부 산하 강릉국유림관리소의 벌채 실적이 많다는 의견이 있어, 관리소별 집계로 확인함.</w:t>
+        <w:t xml:space="preserve">자료: 산림청 『임업통계연보』 국유림 목재매각실적. 통계연보는 지방청 단위까지만 있어, 관리소 단위 실적은 청구로 확인함(강릉국유림관리소의 실적이 많다는 의견 있음).</w:t>
       </w:r>
     </w:p>
     <w:p>
@@ -578,7 +664,7 @@
           <w:b w:val="false"/>
           <w:bCs w:val="false"/>
         </w:rPr>
-        <w:t xml:space="preserve">2. 청구 범위(안): 단계형</w:t>
+        <w:t xml:space="preserve">3. 진행 절차</w:t>
       </w:r>
     </w:p>
     <w:tbl>
@@ -594,9 +680,9 @@
         </w:tblBorders>
       </w:tblPr>
       <w:tblGrid>
-        <w:gridCol w:w="1205"/>
-        <w:gridCol w:w="4066"/>
-        <w:gridCol w:w="4367"/>
+        <w:gridCol w:w="1151"/>
+        <w:gridCol w:w="7336"/>
+        <w:gridCol w:w="1151"/>
       </w:tblGrid>
       <w:tr>
         <w:trPr>
@@ -604,7 +690,7 @@
         </w:trPr>
         <w:tc>
           <w:tcPr>
-            <w:tcW w:type="dxa" w:w="1205"/>
+            <w:tcW w:type="dxa" w:w="1151"/>
             <w:tcBorders>
               <w:top w:val="single" w:color="BFC6BC" w:sz="4"/>
               <w:left w:val="single" w:color="BFC6BC" w:sz="4"/>
@@ -631,13 +717,13 @@
                 <w:sz w:val="18"/>
                 <w:szCs w:val="18"/>
               </w:rPr>
-              <w:t xml:space="preserve">기관</w:t>
-            </w:r>
-          </w:p>
-        </w:tc>
-        <w:tc>
-          <w:tcPr>
-            <w:tcW w:type="dxa" w:w="4066"/>
+              <w:t xml:space="preserve">단계</w:t>
+            </w:r>
+          </w:p>
+        </w:tc>
+        <w:tc>
+          <w:tcPr>
+            <w:tcW w:type="dxa" w:w="7336"/>
             <w:tcBorders>
               <w:top w:val="single" w:color="BFC6BC" w:sz="4"/>
               <w:left w:val="single" w:color="BFC6BC" w:sz="4"/>
@@ -664,13 +750,13 @@
                 <w:sz w:val="18"/>
                 <w:szCs w:val="18"/>
               </w:rPr>
-              <w:t xml:space="preserve">1차 청구(10월 중순)</w:t>
-            </w:r>
-          </w:p>
-        </w:tc>
-        <w:tc>
-          <w:tcPr>
-            <w:tcW w:type="dxa" w:w="4367"/>
+              <w:t xml:space="preserve">내용</w:t>
+            </w:r>
+          </w:p>
+        </w:tc>
+        <w:tc>
+          <w:tcPr>
+            <w:tcW w:type="dxa" w:w="1151"/>
             <w:tcBorders>
               <w:top w:val="single" w:color="BFC6BC" w:sz="4"/>
               <w:left w:val="single" w:color="BFC6BC" w:sz="4"/>
@@ -697,7 +783,7 @@
                 <w:sz w:val="18"/>
                 <w:szCs w:val="18"/>
               </w:rPr>
-              <w:t xml:space="preserve">2차 청구(11월 초)</w:t>
+              <w:t xml:space="preserve">시기</w:t>
             </w:r>
           </w:p>
         </w:tc>
@@ -708,97 +794,400 @@
         </w:trPr>
         <w:tc>
           <w:tcPr>
-            <w:tcW w:type="dxa" w:w="1205"/>
-            <w:tcBorders>
-              <w:top w:val="single" w:color="BFC6BC" w:sz="4"/>
-              <w:left w:val="single" w:color="BFC6BC" w:sz="4"/>
-              <w:bottom w:val="single" w:color="BFC6BC" w:sz="4"/>
-              <w:right w:val="single" w:color="BFC6BC" w:sz="4"/>
-            </w:tcBorders>
-            <w:tcMar>
-              <w:top w:type="dxa" w:w="60"/>
-              <w:left w:type="dxa" w:w="100"/>
-              <w:bottom w:type="dxa" w:w="60"/>
-              <w:right w:type="dxa" w:w="100"/>
-            </w:tcMar>
-          </w:tcPr>
-          <w:p>
-            <w:pPr>
-              <w:spacing w:after="0" w:line="276"/>
-            </w:pPr>
-            <w:r>
-              <w:rPr>
-                <w:rFonts w:ascii="Malgun Gothic" w:cs="Malgun Gothic" w:eastAsia="맑은 고딕" w:hAnsi="Malgun Gothic"/>
-                <w:b w:val="false"/>
-                <w:bCs w:val="false"/>
-                <w:sz w:val="18"/>
-                <w:szCs w:val="18"/>
-              </w:rPr>
-              <w:t xml:space="preserve">동부·북부 공통</w:t>
-            </w:r>
-          </w:p>
-        </w:tc>
-        <w:tc>
-          <w:tcPr>
-            <w:tcW w:type="dxa" w:w="4066"/>
-            <w:tcBorders>
-              <w:top w:val="single" w:color="BFC6BC" w:sz="4"/>
-              <w:left w:val="single" w:color="BFC6BC" w:sz="4"/>
-              <w:bottom w:val="single" w:color="BFC6BC" w:sz="4"/>
-              <w:right w:val="single" w:color="BFC6BC" w:sz="4"/>
-            </w:tcBorders>
-            <w:tcMar>
-              <w:top w:type="dxa" w:w="60"/>
-              <w:left w:type="dxa" w:w="100"/>
-              <w:bottom w:type="dxa" w:w="60"/>
-              <w:right w:type="dxa" w:w="100"/>
-            </w:tcMar>
-          </w:tcPr>
-          <w:p>
-            <w:pPr>
-              <w:spacing w:after="0" w:line="276"/>
-            </w:pPr>
-            <w:r>
-              <w:rPr>
-                <w:rFonts w:ascii="Malgun Gothic" w:cs="Malgun Gothic" w:eastAsia="맑은 고딕" w:hAnsi="Malgun Gothic"/>
-                <w:b w:val="false"/>
-                <w:bCs w:val="false"/>
-                <w:sz w:val="18"/>
-                <w:szCs w:val="18"/>
-              </w:rPr>
-              <w:t xml:space="preserve">관리소별 벌채 실적 집계 + 소반별 벌채이력 목록</w:t>
-            </w:r>
-          </w:p>
-        </w:tc>
-        <w:tc>
-          <w:tcPr>
-            <w:tcW w:type="dxa" w:w="4367"/>
-            <w:tcBorders>
-              <w:top w:val="single" w:color="BFC6BC" w:sz="4"/>
-              <w:left w:val="single" w:color="BFC6BC" w:sz="4"/>
-              <w:bottom w:val="single" w:color="BFC6BC" w:sz="4"/>
-              <w:right w:val="single" w:color="BFC6BC" w:sz="4"/>
-            </w:tcBorders>
-            <w:tcMar>
-              <w:top w:type="dxa" w:w="60"/>
-              <w:left w:type="dxa" w:w="100"/>
-              <w:bottom w:type="dxa" w:w="60"/>
-              <w:right w:type="dxa" w:w="100"/>
-            </w:tcMar>
-          </w:tcPr>
-          <w:p>
-            <w:pPr>
-              <w:spacing w:after="0" w:line="276"/>
-            </w:pPr>
-            <w:r>
-              <w:rPr>
-                <w:rFonts w:ascii="Malgun Gothic" w:cs="Malgun Gothic" w:eastAsia="맑은 고딕" w:hAnsi="Malgun Gothic"/>
-                <w:b w:val="false"/>
-                <w:bCs w:val="false"/>
-                <w:sz w:val="18"/>
-                <w:szCs w:val="18"/>
-              </w:rPr>
-              <w:t xml:space="preserve">목록으로 고른 관리소 1~2곳(강릉 등)의 상세 자료</w:t>
+            <w:tcW w:type="dxa" w:w="1151"/>
+            <w:tcBorders>
+              <w:top w:val="single" w:color="BFC6BC" w:sz="4"/>
+              <w:left w:val="single" w:color="BFC6BC" w:sz="4"/>
+              <w:bottom w:val="single" w:color="BFC6BC" w:sz="4"/>
+              <w:right w:val="single" w:color="BFC6BC" w:sz="4"/>
+            </w:tcBorders>
+            <w:tcMar>
+              <w:top w:type="dxa" w:w="60"/>
+              <w:left w:type="dxa" w:w="100"/>
+              <w:bottom w:type="dxa" w:w="60"/>
+              <w:right w:type="dxa" w:w="100"/>
+            </w:tcMar>
+          </w:tcPr>
+          <w:p>
+            <w:pPr>
+              <w:spacing w:after="0" w:line="276"/>
+            </w:pPr>
+            <w:r>
+              <w:rPr>
+                <w:rFonts w:ascii="Malgun Gothic" w:cs="Malgun Gothic" w:eastAsia="맑은 고딕" w:hAnsi="Malgun Gothic"/>
+                <w:b w:val="false"/>
+                <w:bCs w:val="false"/>
+                <w:sz w:val="18"/>
+                <w:szCs w:val="18"/>
+              </w:rPr>
+              <w:t xml:space="preserve">① 사전 확인</w:t>
+            </w:r>
+          </w:p>
+        </w:tc>
+        <w:tc>
+          <w:tcPr>
+            <w:tcW w:type="dxa" w:w="7336"/>
+            <w:tcBorders>
+              <w:top w:val="single" w:color="BFC6BC" w:sz="4"/>
+              <w:left w:val="single" w:color="BFC6BC" w:sz="4"/>
+              <w:bottom w:val="single" w:color="BFC6BC" w:sz="4"/>
+              <w:right w:val="single" w:color="BFC6BC" w:sz="4"/>
+            </w:tcBorders>
+            <w:tcMar>
+              <w:top w:type="dxa" w:w="60"/>
+              <w:left w:type="dxa" w:w="100"/>
+              <w:bottom w:type="dxa" w:w="60"/>
+              <w:right w:type="dxa" w:w="100"/>
+            </w:tcMar>
+          </w:tcPr>
+          <w:p>
+            <w:pPr>
+              <w:spacing w:after="0" w:line="276"/>
+            </w:pPr>
+            <w:r>
+              <w:rPr>
+                <w:rFonts w:ascii="Malgun Gothic" w:cs="Malgun Gothic" w:eastAsia="맑은 고딕" w:hAnsi="Malgun Gothic"/>
+                <w:b w:val="false"/>
+                <w:bCs w:val="false"/>
+                <w:sz w:val="18"/>
+                <w:szCs w:val="18"/>
+              </w:rPr>
+              <w:t xml:space="preserve">지방청·관리소 담당자에게 산림경영정보시스템의 조회 항목과 추출 가능 형식(엑셀·SHP) 문의</w:t>
+            </w:r>
+          </w:p>
+        </w:tc>
+        <w:tc>
+          <w:tcPr>
+            <w:tcW w:type="dxa" w:w="1151"/>
+            <w:tcBorders>
+              <w:top w:val="single" w:color="BFC6BC" w:sz="4"/>
+              <w:left w:val="single" w:color="BFC6BC" w:sz="4"/>
+              <w:bottom w:val="single" w:color="BFC6BC" w:sz="4"/>
+              <w:right w:val="single" w:color="BFC6BC" w:sz="4"/>
+            </w:tcBorders>
+            <w:tcMar>
+              <w:top w:type="dxa" w:w="60"/>
+              <w:left w:type="dxa" w:w="100"/>
+              <w:bottom w:type="dxa" w:w="60"/>
+              <w:right w:type="dxa" w:w="100"/>
+            </w:tcMar>
+          </w:tcPr>
+          <w:p>
+            <w:pPr>
+              <w:spacing w:after="0" w:line="276"/>
+            </w:pPr>
+            <w:r>
+              <w:rPr>
+                <w:rFonts w:ascii="Malgun Gothic" w:cs="Malgun Gothic" w:eastAsia="맑은 고딕" w:hAnsi="Malgun Gothic"/>
+                <w:b w:val="false"/>
+                <w:bCs w:val="false"/>
+                <w:sz w:val="18"/>
+                <w:szCs w:val="18"/>
+              </w:rPr>
+              <w:t xml:space="preserve">10월 둘째 주</w:t>
+            </w:r>
+          </w:p>
+        </w:tc>
+      </w:tr>
+      <w:tr>
+        <w:trPr>
+          <w:tblHeader w:val="false"/>
+        </w:trPr>
+        <w:tc>
+          <w:tcPr>
+            <w:tcW w:type="dxa" w:w="1151"/>
+            <w:tcBorders>
+              <w:top w:val="single" w:color="BFC6BC" w:sz="4"/>
+              <w:left w:val="single" w:color="BFC6BC" w:sz="4"/>
+              <w:bottom w:val="single" w:color="BFC6BC" w:sz="4"/>
+              <w:right w:val="single" w:color="BFC6BC" w:sz="4"/>
+            </w:tcBorders>
+            <w:tcMar>
+              <w:top w:type="dxa" w:w="60"/>
+              <w:left w:type="dxa" w:w="100"/>
+              <w:bottom w:type="dxa" w:w="60"/>
+              <w:right w:type="dxa" w:w="100"/>
+            </w:tcMar>
+          </w:tcPr>
+          <w:p>
+            <w:pPr>
+              <w:spacing w:after="0" w:line="276"/>
+            </w:pPr>
+            <w:r>
+              <w:rPr>
+                <w:rFonts w:ascii="Malgun Gothic" w:cs="Malgun Gothic" w:eastAsia="맑은 고딕" w:hAnsi="Malgun Gothic"/>
+                <w:b w:val="false"/>
+                <w:bCs w:val="false"/>
+                <w:sz w:val="18"/>
+                <w:szCs w:val="18"/>
+              </w:rPr>
+              <w:t xml:space="preserve">② 1차 청구</w:t>
+            </w:r>
+          </w:p>
+        </w:tc>
+        <w:tc>
+          <w:tcPr>
+            <w:tcW w:type="dxa" w:w="7336"/>
+            <w:tcBorders>
+              <w:top w:val="single" w:color="BFC6BC" w:sz="4"/>
+              <w:left w:val="single" w:color="BFC6BC" w:sz="4"/>
+              <w:bottom w:val="single" w:color="BFC6BC" w:sz="4"/>
+              <w:right w:val="single" w:color="BFC6BC" w:sz="4"/>
+            </w:tcBorders>
+            <w:tcMar>
+              <w:top w:type="dxa" w:w="60"/>
+              <w:left w:type="dxa" w:w="100"/>
+              <w:bottom w:type="dxa" w:w="60"/>
+              <w:right w:type="dxa" w:w="100"/>
+            </w:tcMar>
+          </w:tcPr>
+          <w:p>
+            <w:pPr>
+              <w:spacing w:after="0" w:line="276"/>
+            </w:pPr>
+            <w:r>
+              <w:rPr>
+                <w:rFonts w:ascii="Malgun Gothic" w:cs="Malgun Gothic" w:eastAsia="맑은 고딕" w:hAnsi="Malgun Gothic"/>
+                <w:b w:val="false"/>
+                <w:bCs w:val="false"/>
+                <w:sz w:val="18"/>
+                <w:szCs w:val="18"/>
+              </w:rPr>
+              <w:t xml:space="preserve">두 지방청: 관리소별·연도별 벌채 실적, 소반별 임목생산 실적 목록</w:t>
+            </w:r>
+          </w:p>
+        </w:tc>
+        <w:tc>
+          <w:tcPr>
+            <w:tcW w:type="dxa" w:w="1151"/>
+            <w:tcBorders>
+              <w:top w:val="single" w:color="BFC6BC" w:sz="4"/>
+              <w:left w:val="single" w:color="BFC6BC" w:sz="4"/>
+              <w:bottom w:val="single" w:color="BFC6BC" w:sz="4"/>
+              <w:right w:val="single" w:color="BFC6BC" w:sz="4"/>
+            </w:tcBorders>
+            <w:tcMar>
+              <w:top w:type="dxa" w:w="60"/>
+              <w:left w:type="dxa" w:w="100"/>
+              <w:bottom w:type="dxa" w:w="60"/>
+              <w:right w:type="dxa" w:w="100"/>
+            </w:tcMar>
+          </w:tcPr>
+          <w:p>
+            <w:pPr>
+              <w:spacing w:after="0" w:line="276"/>
+            </w:pPr>
+            <w:r>
+              <w:rPr>
+                <w:rFonts w:ascii="Malgun Gothic" w:cs="Malgun Gothic" w:eastAsia="맑은 고딕" w:hAnsi="Malgun Gothic"/>
+                <w:b w:val="false"/>
+                <w:bCs w:val="false"/>
+                <w:sz w:val="18"/>
+                <w:szCs w:val="18"/>
+              </w:rPr>
+              <w:t xml:space="preserve">10월 중순</w:t>
+            </w:r>
+          </w:p>
+        </w:tc>
+      </w:tr>
+      <w:tr>
+        <w:trPr>
+          <w:tblHeader w:val="false"/>
+        </w:trPr>
+        <w:tc>
+          <w:tcPr>
+            <w:tcW w:type="dxa" w:w="1151"/>
+            <w:tcBorders>
+              <w:top w:val="single" w:color="BFC6BC" w:sz="4"/>
+              <w:left w:val="single" w:color="BFC6BC" w:sz="4"/>
+              <w:bottom w:val="single" w:color="BFC6BC" w:sz="4"/>
+              <w:right w:val="single" w:color="BFC6BC" w:sz="4"/>
+            </w:tcBorders>
+            <w:tcMar>
+              <w:top w:type="dxa" w:w="60"/>
+              <w:left w:type="dxa" w:w="100"/>
+              <w:bottom w:type="dxa" w:w="60"/>
+              <w:right w:type="dxa" w:w="100"/>
+            </w:tcMar>
+          </w:tcPr>
+          <w:p>
+            <w:pPr>
+              <w:spacing w:after="0" w:line="276"/>
+            </w:pPr>
+            <w:r>
+              <w:rPr>
+                <w:rFonts w:ascii="Malgun Gothic" w:cs="Malgun Gothic" w:eastAsia="맑은 고딕" w:hAnsi="Malgun Gothic"/>
+                <w:b w:val="false"/>
+                <w:bCs w:val="false"/>
+                <w:sz w:val="18"/>
+                <w:szCs w:val="18"/>
+              </w:rPr>
+              <w:t xml:space="preserve">③ 사례지 선정</w:t>
+            </w:r>
+          </w:p>
+        </w:tc>
+        <w:tc>
+          <w:tcPr>
+            <w:tcW w:type="dxa" w:w="7336"/>
+            <w:tcBorders>
+              <w:top w:val="single" w:color="BFC6BC" w:sz="4"/>
+              <w:left w:val="single" w:color="BFC6BC" w:sz="4"/>
+              <w:bottom w:val="single" w:color="BFC6BC" w:sz="4"/>
+              <w:right w:val="single" w:color="BFC6BC" w:sz="4"/>
+            </w:tcBorders>
+            <w:tcMar>
+              <w:top w:type="dxa" w:w="60"/>
+              <w:left w:type="dxa" w:w="100"/>
+              <w:bottom w:type="dxa" w:w="60"/>
+              <w:right w:type="dxa" w:w="100"/>
+            </w:tcMar>
+          </w:tcPr>
+          <w:p>
+            <w:pPr>
+              <w:spacing w:after="0" w:line="276"/>
+            </w:pPr>
+            <w:r>
+              <w:rPr>
+                <w:rFonts w:ascii="Malgun Gothic" w:cs="Malgun Gothic" w:eastAsia="맑은 고딕" w:hAnsi="Malgun Gothic"/>
+                <w:b w:val="false"/>
+                <w:bCs w:val="false"/>
+                <w:sz w:val="18"/>
+                <w:szCs w:val="18"/>
+              </w:rPr>
+              <w:t xml:space="preserve">벌채 실적 상위 관리소 1~2곳, 경과연수별 소반 선정</w:t>
+            </w:r>
+          </w:p>
+        </w:tc>
+        <w:tc>
+          <w:tcPr>
+            <w:tcW w:type="dxa" w:w="1151"/>
+            <w:tcBorders>
+              <w:top w:val="single" w:color="BFC6BC" w:sz="4"/>
+              <w:left w:val="single" w:color="BFC6BC" w:sz="4"/>
+              <w:bottom w:val="single" w:color="BFC6BC" w:sz="4"/>
+              <w:right w:val="single" w:color="BFC6BC" w:sz="4"/>
+            </w:tcBorders>
+            <w:tcMar>
+              <w:top w:type="dxa" w:w="60"/>
+              <w:left w:type="dxa" w:w="100"/>
+              <w:bottom w:type="dxa" w:w="60"/>
+              <w:right w:type="dxa" w:w="100"/>
+            </w:tcMar>
+          </w:tcPr>
+          <w:p>
+            <w:pPr>
+              <w:spacing w:after="0" w:line="276"/>
+            </w:pPr>
+            <w:r>
+              <w:rPr>
+                <w:rFonts w:ascii="Malgun Gothic" w:cs="Malgun Gothic" w:eastAsia="맑은 고딕" w:hAnsi="Malgun Gothic"/>
+                <w:b w:val="false"/>
+                <w:bCs w:val="false"/>
+                <w:sz w:val="18"/>
+                <w:szCs w:val="18"/>
+              </w:rPr>
+              <w:t xml:space="preserve">11월 초</w:t>
+            </w:r>
+          </w:p>
+        </w:tc>
+      </w:tr>
+      <w:tr>
+        <w:trPr>
+          <w:tblHeader w:val="false"/>
+        </w:trPr>
+        <w:tc>
+          <w:tcPr>
+            <w:tcW w:type="dxa" w:w="1151"/>
+            <w:tcBorders>
+              <w:top w:val="single" w:color="BFC6BC" w:sz="4"/>
+              <w:left w:val="single" w:color="BFC6BC" w:sz="4"/>
+              <w:bottom w:val="single" w:color="BFC6BC" w:sz="4"/>
+              <w:right w:val="single" w:color="BFC6BC" w:sz="4"/>
+            </w:tcBorders>
+            <w:tcMar>
+              <w:top w:type="dxa" w:w="60"/>
+              <w:left w:type="dxa" w:w="100"/>
+              <w:bottom w:type="dxa" w:w="60"/>
+              <w:right w:type="dxa" w:w="100"/>
+            </w:tcMar>
+          </w:tcPr>
+          <w:p>
+            <w:pPr>
+              <w:spacing w:after="0" w:line="276"/>
+            </w:pPr>
+            <w:r>
+              <w:rPr>
+                <w:rFonts w:ascii="Malgun Gothic" w:cs="Malgun Gothic" w:eastAsia="맑은 고딕" w:hAnsi="Malgun Gothic"/>
+                <w:b w:val="false"/>
+                <w:bCs w:val="false"/>
+                <w:sz w:val="18"/>
+                <w:szCs w:val="18"/>
+              </w:rPr>
+              <w:t xml:space="preserve">④ 2차 청구</w:t>
+            </w:r>
+          </w:p>
+        </w:tc>
+        <w:tc>
+          <w:tcPr>
+            <w:tcW w:type="dxa" w:w="7336"/>
+            <w:tcBorders>
+              <w:top w:val="single" w:color="BFC6BC" w:sz="4"/>
+              <w:left w:val="single" w:color="BFC6BC" w:sz="4"/>
+              <w:bottom w:val="single" w:color="BFC6BC" w:sz="4"/>
+              <w:right w:val="single" w:color="BFC6BC" w:sz="4"/>
+            </w:tcBorders>
+            <w:tcMar>
+              <w:top w:type="dxa" w:w="60"/>
+              <w:left w:type="dxa" w:w="100"/>
+              <w:bottom w:type="dxa" w:w="60"/>
+              <w:right w:type="dxa" w:w="100"/>
+            </w:tcMar>
+          </w:tcPr>
+          <w:p>
+            <w:pPr>
+              <w:spacing w:after="0" w:line="276"/>
+            </w:pPr>
+            <w:r>
+              <w:rPr>
+                <w:rFonts w:ascii="Malgun Gothic" w:cs="Malgun Gothic" w:eastAsia="맑은 고딕" w:hAnsi="Malgun Gothic"/>
+                <w:b w:val="false"/>
+                <w:bCs w:val="false"/>
+                <w:sz w:val="18"/>
+                <w:szCs w:val="18"/>
+              </w:rPr>
+              <w:t xml:space="preserve">선정 관리소: 소반별 산림현황·임황·실행실적, 임도, 산사태·사방사업 이력</w:t>
+            </w:r>
+          </w:p>
+        </w:tc>
+        <w:tc>
+          <w:tcPr>
+            <w:tcW w:type="dxa" w:w="1151"/>
+            <w:tcBorders>
+              <w:top w:val="single" w:color="BFC6BC" w:sz="4"/>
+              <w:left w:val="single" w:color="BFC6BC" w:sz="4"/>
+              <w:bottom w:val="single" w:color="BFC6BC" w:sz="4"/>
+              <w:right w:val="single" w:color="BFC6BC" w:sz="4"/>
+            </w:tcBorders>
+            <w:tcMar>
+              <w:top w:type="dxa" w:w="60"/>
+              <w:left w:type="dxa" w:w="100"/>
+              <w:bottom w:type="dxa" w:w="60"/>
+              <w:right w:type="dxa" w:w="100"/>
+            </w:tcMar>
+          </w:tcPr>
+          <w:p>
+            <w:pPr>
+              <w:spacing w:after="0" w:line="276"/>
+            </w:pPr>
+            <w:r>
+              <w:rPr>
+                <w:rFonts w:ascii="Malgun Gothic" w:cs="Malgun Gothic" w:eastAsia="맑은 고딕" w:hAnsi="Malgun Gothic"/>
+                <w:b w:val="false"/>
+                <w:bCs w:val="false"/>
+                <w:sz w:val="18"/>
+                <w:szCs w:val="18"/>
+              </w:rPr>
+              <w:t xml:space="preserve">11월 초~말</w:t>
             </w:r>
           </w:p>
         </w:tc>
@@ -808,136 +1197,6 @@
       <w:pPr>
         <w:spacing w:after="60"/>
       </w:pPr>
-    </w:p>
-    <w:p>
-      <w:pPr>
-        <w:spacing w:after="120"/>
-      </w:pPr>
-      <w:r>
-        <w:rPr>
-          <w:rFonts w:ascii="Malgun Gothic" w:cs="Malgun Gothic" w:eastAsia="맑은 고딕" w:hAnsi="Malgun Gothic"/>
-          <w:b w:val="false"/>
-          <w:bCs w:val="false"/>
-        </w:rPr>
-        <w:t xml:space="preserve">관리소를 미리 정하지 않고, 두 지방청 전체 목록을 받아 경과연수별 벌채지가 갖춰진 관리소를 고름. 상세 자료(경영계획·임도)까지 처음부터 전부 받으면 처리 기간이 연장될 가능성이 커서, 상세 자료는 2차로 좁혀 받음.</w:t>
-      </w:r>
-    </w:p>
-    <w:p>
-      <w:pPr>
-        <w:pStyle w:val="Heading1"/>
-      </w:pPr>
-      <w:r>
-        <w:rPr>
-          <w:rFonts w:ascii="Malgun Gothic" w:cs="Malgun Gothic" w:eastAsia="맑은 고딕" w:hAnsi="Malgun Gothic"/>
-          <w:b w:val="false"/>
-          <w:bCs w:val="false"/>
-        </w:rPr>
-        <w:t xml:space="preserve">3. 청구 항목</w:t>
-      </w:r>
-    </w:p>
-    <w:p>
-      <w:pPr>
-        <w:pStyle w:val="ListParagraph"/>
-        <w:numPr>
-          <w:ilvl w:val="0"/>
-          <w:numId w:val="2"/>
-        </w:numPr>
-        <w:spacing w:after="60"/>
-      </w:pPr>
-      <w:r>
-        <w:rPr>
-          <w:rFonts w:ascii="Malgun Gothic" w:cs="Malgun Gothic" w:eastAsia="맑은 고딕" w:hAnsi="Malgun Gothic"/>
-          <w:b/>
-          <w:bCs/>
-        </w:rPr>
-        <w:t xml:space="preserve">벌채 실적 집계</w:t>
-      </w:r>
-      <w:r>
-        <w:rPr>
-          <w:rFonts w:ascii="Malgun Gothic" w:cs="Malgun Gothic" w:eastAsia="맑은 고딕" w:hAnsi="Malgun Gothic"/>
-          <w:b w:val="false"/>
-          <w:bCs w:val="false"/>
-        </w:rPr>
-        <w:t xml:space="preserve">: 관리소별·연도별 건수, 벌채면적, 입목재적</w:t>
-      </w:r>
-    </w:p>
-    <w:p>
-      <w:pPr>
-        <w:pStyle w:val="ListParagraph"/>
-        <w:numPr>
-          <w:ilvl w:val="0"/>
-          <w:numId w:val="2"/>
-        </w:numPr>
-        <w:spacing w:after="60"/>
-      </w:pPr>
-      <w:r>
-        <w:rPr>
-          <w:rFonts w:ascii="Malgun Gothic" w:cs="Malgun Gothic" w:eastAsia="맑은 고딕" w:hAnsi="Malgun Gothic"/>
-          <w:b/>
-          <w:bCs/>
-        </w:rPr>
-        <w:t xml:space="preserve">소반별 벌채이력</w:t>
-      </w:r>
-      <w:r>
-        <w:rPr>
-          <w:rFonts w:ascii="Malgun Gothic" w:cs="Malgun Gothic" w:eastAsia="맑은 고딕" w:hAnsi="Malgun Gothic"/>
-          <w:b w:val="false"/>
-          <w:bCs w:val="false"/>
-        </w:rPr>
-        <w:t xml:space="preserve">: 연도, 임반·소반, 벌채 종류, 면적, 수종, 집재 방법·집재로 개설 여부</w:t>
-      </w:r>
-    </w:p>
-    <w:p>
-      <w:pPr>
-        <w:pStyle w:val="ListParagraph"/>
-        <w:numPr>
-          <w:ilvl w:val="0"/>
-          <w:numId w:val="2"/>
-        </w:numPr>
-        <w:spacing w:after="60"/>
-      </w:pPr>
-      <w:r>
-        <w:rPr>
-          <w:rFonts w:ascii="Malgun Gothic" w:cs="Malgun Gothic" w:eastAsia="맑은 고딕" w:hAnsi="Malgun Gothic"/>
-          <w:b/>
-          <w:bCs/>
-        </w:rPr>
-        <w:t xml:space="preserve">산림경영계획 자료</w:t>
-      </w:r>
-      <w:r>
-        <w:rPr>
-          <w:rFonts w:ascii="Malgun Gothic" w:cs="Malgun Gothic" w:eastAsia="맑은 고딕" w:hAnsi="Malgun Gothic"/>
-          <w:b w:val="false"/>
-          <w:bCs w:val="false"/>
-        </w:rPr>
-        <w:t xml:space="preserve">: 소반별 경사·토양, 임상, 영급, 우점 수종, 조림 이력</w:t>
-      </w:r>
-    </w:p>
-    <w:p>
-      <w:pPr>
-        <w:pStyle w:val="ListParagraph"/>
-        <w:numPr>
-          <w:ilvl w:val="0"/>
-          <w:numId w:val="2"/>
-        </w:numPr>
-        <w:spacing w:after="60"/>
-      </w:pPr>
-      <w:r>
-        <w:rPr>
-          <w:rFonts w:ascii="Malgun Gothic" w:cs="Malgun Gothic" w:eastAsia="맑은 고딕" w:hAnsi="Malgun Gothic"/>
-          <w:b/>
-          <w:bCs/>
-        </w:rPr>
-        <w:t xml:space="preserve">임도·교란 이력</w:t>
-      </w:r>
-      <w:r>
-        <w:rPr>
-          <w:rFonts w:ascii="Malgun Gothic" w:cs="Malgun Gothic" w:eastAsia="맑은 고딕" w:hAnsi="Malgun Gothic"/>
-          <w:b w:val="false"/>
-          <w:bCs w:val="false"/>
-        </w:rPr>
-        <w:t xml:space="preserve">: 임도 노선(SHP)과 개설 연도, 산불·병해충 피해 이력</w:t>
-      </w:r>
     </w:p>
     <w:p>
       <w:pPr>
@@ -952,7 +1211,7 @@
           <w:sz w:val="18"/>
           <w:szCs w:val="18"/>
         </w:rPr>
-        <w:t xml:space="preserve">공통 조건: 보유 기간 전체, 전자파일(엑셀·SHP). 매수자 상호·계약금액·개인정보는 제외(비공개 사유 회피). 1차는 1·2번, 2차(선정 관리소)는 2~4번.</w:t>
+        <w:t xml:space="preserve">정보공개포털(open.go.kr)로 기관별 청구. 10일 이내 결정, 최대 10일 연장.</w:t>
       </w:r>
     </w:p>
     <w:p>
@@ -965,8 +1224,842 @@
           <w:b w:val="false"/>
           <w:bCs w:val="false"/>
         </w:rPr>
-        <w:t xml:space="preserve">4. 절차와 일정</w:t>
-      </w:r>
+        <w:t xml:space="preserve">4. 요청 정보 사양(산림경영계획서 기재요령 기준)</w:t>
+      </w:r>
+    </w:p>
+    <w:tbl>
+      <w:tblPr>
+        <w:tblW w:type="dxa" w:w="9638"/>
+        <w:tblBorders>
+          <w:top w:val="single" w:color="auto" w:sz="4"/>
+          <w:left w:val="single" w:color="auto" w:sz="4"/>
+          <w:bottom w:val="single" w:color="auto" w:sz="4"/>
+          <w:right w:val="single" w:color="auto" w:sz="4"/>
+          <w:insideH w:val="single" w:color="auto" w:sz="4"/>
+          <w:insideV w:val="single" w:color="auto" w:sz="4"/>
+        </w:tblBorders>
+      </w:tblPr>
+      <w:tblGrid>
+        <w:gridCol w:w="876"/>
+        <w:gridCol w:w="7886"/>
+        <w:gridCol w:w="876"/>
+      </w:tblGrid>
+      <w:tr>
+        <w:trPr>
+          <w:tblHeader/>
+        </w:trPr>
+        <w:tc>
+          <w:tcPr>
+            <w:tcW w:type="dxa" w:w="876"/>
+            <w:tcBorders>
+              <w:top w:val="single" w:color="BFC6BC" w:sz="4"/>
+              <w:left w:val="single" w:color="BFC6BC" w:sz="4"/>
+              <w:bottom w:val="single" w:color="BFC6BC" w:sz="4"/>
+              <w:right w:val="single" w:color="BFC6BC" w:sz="4"/>
+            </w:tcBorders>
+            <w:shd w:fill="E4EDE6" w:color="auto" w:val="clear"/>
+            <w:tcMar>
+              <w:top w:type="dxa" w:w="60"/>
+              <w:left w:type="dxa" w:w="100"/>
+              <w:bottom w:type="dxa" w:w="60"/>
+              <w:right w:type="dxa" w:w="100"/>
+            </w:tcMar>
+          </w:tcPr>
+          <w:p>
+            <w:pPr>
+              <w:spacing w:after="0" w:line="276"/>
+            </w:pPr>
+            <w:r>
+              <w:rPr>
+                <w:rFonts w:ascii="Malgun Gothic" w:cs="Malgun Gothic" w:eastAsia="맑은 고딕" w:hAnsi="Malgun Gothic"/>
+                <w:b/>
+                <w:bCs/>
+                <w:sz w:val="18"/>
+                <w:szCs w:val="18"/>
+              </w:rPr>
+              <w:t xml:space="preserve">구분</w:t>
+            </w:r>
+          </w:p>
+        </w:tc>
+        <w:tc>
+          <w:tcPr>
+            <w:tcW w:type="dxa" w:w="7886"/>
+            <w:tcBorders>
+              <w:top w:val="single" w:color="BFC6BC" w:sz="4"/>
+              <w:left w:val="single" w:color="BFC6BC" w:sz="4"/>
+              <w:bottom w:val="single" w:color="BFC6BC" w:sz="4"/>
+              <w:right w:val="single" w:color="BFC6BC" w:sz="4"/>
+            </w:tcBorders>
+            <w:shd w:fill="E4EDE6" w:color="auto" w:val="clear"/>
+            <w:tcMar>
+              <w:top w:type="dxa" w:w="60"/>
+              <w:left w:type="dxa" w:w="100"/>
+              <w:bottom w:type="dxa" w:w="60"/>
+              <w:right w:type="dxa" w:w="100"/>
+            </w:tcMar>
+          </w:tcPr>
+          <w:p>
+            <w:pPr>
+              <w:spacing w:after="0" w:line="276"/>
+            </w:pPr>
+            <w:r>
+              <w:rPr>
+                <w:rFonts w:ascii="Malgun Gothic" w:cs="Malgun Gothic" w:eastAsia="맑은 고딕" w:hAnsi="Malgun Gothic"/>
+                <w:b/>
+                <w:bCs/>
+                <w:sz w:val="18"/>
+                <w:szCs w:val="18"/>
+              </w:rPr>
+              <w:t xml:space="preserve">요청 항목(기재요령 항목명)</w:t>
+            </w:r>
+          </w:p>
+        </w:tc>
+        <w:tc>
+          <w:tcPr>
+            <w:tcW w:type="dxa" w:w="876"/>
+            <w:tcBorders>
+              <w:top w:val="single" w:color="BFC6BC" w:sz="4"/>
+              <w:left w:val="single" w:color="BFC6BC" w:sz="4"/>
+              <w:bottom w:val="single" w:color="BFC6BC" w:sz="4"/>
+              <w:right w:val="single" w:color="BFC6BC" w:sz="4"/>
+            </w:tcBorders>
+            <w:shd w:fill="E4EDE6" w:color="auto" w:val="clear"/>
+            <w:tcMar>
+              <w:top w:type="dxa" w:w="60"/>
+              <w:left w:type="dxa" w:w="100"/>
+              <w:bottom w:type="dxa" w:w="60"/>
+              <w:right w:type="dxa" w:w="100"/>
+            </w:tcMar>
+          </w:tcPr>
+          <w:p>
+            <w:pPr>
+              <w:spacing w:after="0" w:line="276"/>
+            </w:pPr>
+            <w:r>
+              <w:rPr>
+                <w:rFonts w:ascii="Malgun Gothic" w:cs="Malgun Gothic" w:eastAsia="맑은 고딕" w:hAnsi="Malgun Gothic"/>
+                <w:b/>
+                <w:bCs/>
+                <w:sz w:val="18"/>
+                <w:szCs w:val="18"/>
+              </w:rPr>
+              <w:t xml:space="preserve">차수</w:t>
+            </w:r>
+          </w:p>
+        </w:tc>
+      </w:tr>
+      <w:tr>
+        <w:trPr>
+          <w:tblHeader w:val="false"/>
+        </w:trPr>
+        <w:tc>
+          <w:tcPr>
+            <w:tcW w:type="dxa" w:w="876"/>
+            <w:tcBorders>
+              <w:top w:val="single" w:color="BFC6BC" w:sz="4"/>
+              <w:left w:val="single" w:color="BFC6BC" w:sz="4"/>
+              <w:bottom w:val="single" w:color="BFC6BC" w:sz="4"/>
+              <w:right w:val="single" w:color="BFC6BC" w:sz="4"/>
+            </w:tcBorders>
+            <w:tcMar>
+              <w:top w:type="dxa" w:w="60"/>
+              <w:left w:type="dxa" w:w="100"/>
+              <w:bottom w:type="dxa" w:w="60"/>
+              <w:right w:type="dxa" w:w="100"/>
+            </w:tcMar>
+          </w:tcPr>
+          <w:p>
+            <w:pPr>
+              <w:spacing w:after="0" w:line="276"/>
+            </w:pPr>
+            <w:r>
+              <w:rPr>
+                <w:rFonts w:ascii="Malgun Gothic" w:cs="Malgun Gothic" w:eastAsia="맑은 고딕" w:hAnsi="Malgun Gothic"/>
+                <w:b w:val="false"/>
+                <w:bCs w:val="false"/>
+                <w:sz w:val="18"/>
+                <w:szCs w:val="18"/>
+              </w:rPr>
+              <w:t xml:space="preserve">벌채 실적</w:t>
+            </w:r>
+          </w:p>
+        </w:tc>
+        <w:tc>
+          <w:tcPr>
+            <w:tcW w:type="dxa" w:w="7886"/>
+            <w:tcBorders>
+              <w:top w:val="single" w:color="BFC6BC" w:sz="4"/>
+              <w:left w:val="single" w:color="BFC6BC" w:sz="4"/>
+              <w:bottom w:val="single" w:color="BFC6BC" w:sz="4"/>
+              <w:right w:val="single" w:color="BFC6BC" w:sz="4"/>
+            </w:tcBorders>
+            <w:tcMar>
+              <w:top w:type="dxa" w:w="60"/>
+              <w:left w:type="dxa" w:w="100"/>
+              <w:bottom w:type="dxa" w:w="60"/>
+              <w:right w:type="dxa" w:w="100"/>
+            </w:tcMar>
+          </w:tcPr>
+          <w:p>
+            <w:pPr>
+              <w:spacing w:after="0" w:line="276"/>
+            </w:pPr>
+            <w:r>
+              <w:rPr>
+                <w:rFonts w:ascii="Malgun Gothic" w:cs="Malgun Gothic" w:eastAsia="맑은 고딕" w:hAnsi="Malgun Gothic"/>
+                <w:b w:val="false"/>
+                <w:bCs w:val="false"/>
+                <w:sz w:val="18"/>
+                <w:szCs w:val="18"/>
+              </w:rPr>
+              <w:t xml:space="preserve">관리소별·연도별 계약건수, 벌채면적(ha), 입목재적(㎥)</w:t>
+            </w:r>
+          </w:p>
+        </w:tc>
+        <w:tc>
+          <w:tcPr>
+            <w:tcW w:type="dxa" w:w="876"/>
+            <w:tcBorders>
+              <w:top w:val="single" w:color="BFC6BC" w:sz="4"/>
+              <w:left w:val="single" w:color="BFC6BC" w:sz="4"/>
+              <w:bottom w:val="single" w:color="BFC6BC" w:sz="4"/>
+              <w:right w:val="single" w:color="BFC6BC" w:sz="4"/>
+            </w:tcBorders>
+            <w:tcMar>
+              <w:top w:type="dxa" w:w="60"/>
+              <w:left w:type="dxa" w:w="100"/>
+              <w:bottom w:type="dxa" w:w="60"/>
+              <w:right w:type="dxa" w:w="100"/>
+            </w:tcMar>
+          </w:tcPr>
+          <w:p>
+            <w:pPr>
+              <w:spacing w:after="0" w:line="276"/>
+            </w:pPr>
+            <w:r>
+              <w:rPr>
+                <w:rFonts w:ascii="Malgun Gothic" w:cs="Malgun Gothic" w:eastAsia="맑은 고딕" w:hAnsi="Malgun Gothic"/>
+                <w:b w:val="false"/>
+                <w:bCs w:val="false"/>
+                <w:sz w:val="18"/>
+                <w:szCs w:val="18"/>
+              </w:rPr>
+              <w:t xml:space="preserve">1차</w:t>
+            </w:r>
+          </w:p>
+        </w:tc>
+      </w:tr>
+      <w:tr>
+        <w:trPr>
+          <w:tblHeader w:val="false"/>
+        </w:trPr>
+        <w:tc>
+          <w:tcPr>
+            <w:tcW w:type="dxa" w:w="876"/>
+            <w:tcBorders>
+              <w:top w:val="single" w:color="BFC6BC" w:sz="4"/>
+              <w:left w:val="single" w:color="BFC6BC" w:sz="4"/>
+              <w:bottom w:val="single" w:color="BFC6BC" w:sz="4"/>
+              <w:right w:val="single" w:color="BFC6BC" w:sz="4"/>
+            </w:tcBorders>
+            <w:tcMar>
+              <w:top w:type="dxa" w:w="60"/>
+              <w:left w:type="dxa" w:w="100"/>
+              <w:bottom w:type="dxa" w:w="60"/>
+              <w:right w:type="dxa" w:w="100"/>
+            </w:tcMar>
+          </w:tcPr>
+          <w:p>
+            <w:pPr>
+              <w:spacing w:after="0" w:line="276"/>
+            </w:pPr>
+            <w:r>
+              <w:rPr>
+                <w:rFonts w:ascii="Malgun Gothic" w:cs="Malgun Gothic" w:eastAsia="맑은 고딕" w:hAnsi="Malgun Gothic"/>
+                <w:b w:val="false"/>
+                <w:bCs w:val="false"/>
+                <w:sz w:val="18"/>
+                <w:szCs w:val="18"/>
+              </w:rPr>
+              <w:t xml:space="preserve">임목생산 실적</w:t>
+            </w:r>
+          </w:p>
+        </w:tc>
+        <w:tc>
+          <w:tcPr>
+            <w:tcW w:type="dxa" w:w="7886"/>
+            <w:tcBorders>
+              <w:top w:val="single" w:color="BFC6BC" w:sz="4"/>
+              <w:left w:val="single" w:color="BFC6BC" w:sz="4"/>
+              <w:bottom w:val="single" w:color="BFC6BC" w:sz="4"/>
+              <w:right w:val="single" w:color="BFC6BC" w:sz="4"/>
+            </w:tcBorders>
+            <w:tcMar>
+              <w:top w:type="dxa" w:w="60"/>
+              <w:left w:type="dxa" w:w="100"/>
+              <w:bottom w:type="dxa" w:w="60"/>
+              <w:right w:type="dxa" w:w="100"/>
+            </w:tcMar>
+          </w:tcPr>
+          <w:p>
+            <w:pPr>
+              <w:spacing w:after="0" w:line="276"/>
+            </w:pPr>
+            <w:r>
+              <w:rPr>
+                <w:rFonts w:ascii="Malgun Gothic" w:cs="Malgun Gothic" w:eastAsia="맑은 고딕" w:hAnsi="Malgun Gothic"/>
+                <w:b w:val="false"/>
+                <w:bCs w:val="false"/>
+                <w:sz w:val="18"/>
+                <w:szCs w:val="18"/>
+              </w:rPr>
+              <w:t xml:space="preserve">연도, 임반·소반 번호(예: 1-0-1), 사업종(간벌·주벌), 작업종(모두베기·모수작업·골라베기·왜림작업), 면적, 수종, 재적</w:t>
+            </w:r>
+          </w:p>
+        </w:tc>
+        <w:tc>
+          <w:tcPr>
+            <w:tcW w:type="dxa" w:w="876"/>
+            <w:tcBorders>
+              <w:top w:val="single" w:color="BFC6BC" w:sz="4"/>
+              <w:left w:val="single" w:color="BFC6BC" w:sz="4"/>
+              <w:bottom w:val="single" w:color="BFC6BC" w:sz="4"/>
+              <w:right w:val="single" w:color="BFC6BC" w:sz="4"/>
+            </w:tcBorders>
+            <w:tcMar>
+              <w:top w:type="dxa" w:w="60"/>
+              <w:left w:type="dxa" w:w="100"/>
+              <w:bottom w:type="dxa" w:w="60"/>
+              <w:right w:type="dxa" w:w="100"/>
+            </w:tcMar>
+          </w:tcPr>
+          <w:p>
+            <w:pPr>
+              <w:spacing w:after="0" w:line="276"/>
+            </w:pPr>
+            <w:r>
+              <w:rPr>
+                <w:rFonts w:ascii="Malgun Gothic" w:cs="Malgun Gothic" w:eastAsia="맑은 고딕" w:hAnsi="Malgun Gothic"/>
+                <w:b w:val="false"/>
+                <w:bCs w:val="false"/>
+                <w:sz w:val="18"/>
+                <w:szCs w:val="18"/>
+              </w:rPr>
+              <w:t xml:space="preserve">1차</w:t>
+            </w:r>
+          </w:p>
+        </w:tc>
+      </w:tr>
+      <w:tr>
+        <w:trPr>
+          <w:tblHeader w:val="false"/>
+        </w:trPr>
+        <w:tc>
+          <w:tcPr>
+            <w:tcW w:type="dxa" w:w="876"/>
+            <w:tcBorders>
+              <w:top w:val="single" w:color="BFC6BC" w:sz="4"/>
+              <w:left w:val="single" w:color="BFC6BC" w:sz="4"/>
+              <w:bottom w:val="single" w:color="BFC6BC" w:sz="4"/>
+              <w:right w:val="single" w:color="BFC6BC" w:sz="4"/>
+            </w:tcBorders>
+            <w:tcMar>
+              <w:top w:type="dxa" w:w="60"/>
+              <w:left w:type="dxa" w:w="100"/>
+              <w:bottom w:type="dxa" w:w="60"/>
+              <w:right w:type="dxa" w:w="100"/>
+            </w:tcMar>
+          </w:tcPr>
+          <w:p>
+            <w:pPr>
+              <w:spacing w:after="0" w:line="276"/>
+            </w:pPr>
+            <w:r>
+              <w:rPr>
+                <w:rFonts w:ascii="Malgun Gothic" w:cs="Malgun Gothic" w:eastAsia="맑은 고딕" w:hAnsi="Malgun Gothic"/>
+                <w:b w:val="false"/>
+                <w:bCs w:val="false"/>
+                <w:sz w:val="18"/>
+                <w:szCs w:val="18"/>
+              </w:rPr>
+              <w:t xml:space="preserve">산림현황</w:t>
+            </w:r>
+          </w:p>
+        </w:tc>
+        <w:tc>
+          <w:tcPr>
+            <w:tcW w:type="dxa" w:w="7886"/>
+            <w:tcBorders>
+              <w:top w:val="single" w:color="BFC6BC" w:sz="4"/>
+              <w:left w:val="single" w:color="BFC6BC" w:sz="4"/>
+              <w:bottom w:val="single" w:color="BFC6BC" w:sz="4"/>
+              <w:right w:val="single" w:color="BFC6BC" w:sz="4"/>
+            </w:tcBorders>
+            <w:tcMar>
+              <w:top w:type="dxa" w:w="60"/>
+              <w:left w:type="dxa" w:w="100"/>
+              <w:bottom w:type="dxa" w:w="60"/>
+              <w:right w:type="dxa" w:w="100"/>
+            </w:tcMar>
+          </w:tcPr>
+          <w:p>
+            <w:pPr>
+              <w:spacing w:after="0" w:line="276"/>
+            </w:pPr>
+            <w:r>
+              <w:rPr>
+                <w:rFonts w:ascii="Malgun Gothic" w:cs="Malgun Gothic" w:eastAsia="맑은 고딕" w:hAnsi="Malgun Gothic"/>
+                <w:b w:val="false"/>
+                <w:bCs w:val="false"/>
+                <w:sz w:val="18"/>
+                <w:szCs w:val="18"/>
+              </w:rPr>
+              <w:t xml:space="preserve">소반 면적, 산지구분, 경사도(완 &lt;15° · 경 15~20° · 급 20~25° · 험 25~30° · 절 ≥30°)</w:t>
+            </w:r>
+          </w:p>
+        </w:tc>
+        <w:tc>
+          <w:tcPr>
+            <w:tcW w:type="dxa" w:w="876"/>
+            <w:tcBorders>
+              <w:top w:val="single" w:color="BFC6BC" w:sz="4"/>
+              <w:left w:val="single" w:color="BFC6BC" w:sz="4"/>
+              <w:bottom w:val="single" w:color="BFC6BC" w:sz="4"/>
+              <w:right w:val="single" w:color="BFC6BC" w:sz="4"/>
+            </w:tcBorders>
+            <w:tcMar>
+              <w:top w:type="dxa" w:w="60"/>
+              <w:left w:type="dxa" w:w="100"/>
+              <w:bottom w:type="dxa" w:w="60"/>
+              <w:right w:type="dxa" w:w="100"/>
+            </w:tcMar>
+          </w:tcPr>
+          <w:p>
+            <w:pPr>
+              <w:spacing w:after="0" w:line="276"/>
+            </w:pPr>
+            <w:r>
+              <w:rPr>
+                <w:rFonts w:ascii="Malgun Gothic" w:cs="Malgun Gothic" w:eastAsia="맑은 고딕" w:hAnsi="Malgun Gothic"/>
+                <w:b w:val="false"/>
+                <w:bCs w:val="false"/>
+                <w:sz w:val="18"/>
+                <w:szCs w:val="18"/>
+              </w:rPr>
+              <w:t xml:space="preserve">2차</w:t>
+            </w:r>
+          </w:p>
+        </w:tc>
+      </w:tr>
+      <w:tr>
+        <w:trPr>
+          <w:tblHeader w:val="false"/>
+        </w:trPr>
+        <w:tc>
+          <w:tcPr>
+            <w:tcW w:type="dxa" w:w="876"/>
+            <w:tcBorders>
+              <w:top w:val="single" w:color="BFC6BC" w:sz="4"/>
+              <w:left w:val="single" w:color="BFC6BC" w:sz="4"/>
+              <w:bottom w:val="single" w:color="BFC6BC" w:sz="4"/>
+              <w:right w:val="single" w:color="BFC6BC" w:sz="4"/>
+            </w:tcBorders>
+            <w:tcMar>
+              <w:top w:type="dxa" w:w="60"/>
+              <w:left w:type="dxa" w:w="100"/>
+              <w:bottom w:type="dxa" w:w="60"/>
+              <w:right w:type="dxa" w:w="100"/>
+            </w:tcMar>
+          </w:tcPr>
+          <w:p>
+            <w:pPr>
+              <w:spacing w:after="0" w:line="276"/>
+            </w:pPr>
+            <w:r>
+              <w:rPr>
+                <w:rFonts w:ascii="Malgun Gothic" w:cs="Malgun Gothic" w:eastAsia="맑은 고딕" w:hAnsi="Malgun Gothic"/>
+                <w:b w:val="false"/>
+                <w:bCs w:val="false"/>
+                <w:sz w:val="18"/>
+                <w:szCs w:val="18"/>
+              </w:rPr>
+              <w:t xml:space="preserve">임황</w:t>
+            </w:r>
+          </w:p>
+        </w:tc>
+        <w:tc>
+          <w:tcPr>
+            <w:tcW w:type="dxa" w:w="7886"/>
+            <w:tcBorders>
+              <w:top w:val="single" w:color="BFC6BC" w:sz="4"/>
+              <w:left w:val="single" w:color="BFC6BC" w:sz="4"/>
+              <w:bottom w:val="single" w:color="BFC6BC" w:sz="4"/>
+              <w:right w:val="single" w:color="BFC6BC" w:sz="4"/>
+            </w:tcBorders>
+            <w:tcMar>
+              <w:top w:type="dxa" w:w="60"/>
+              <w:left w:type="dxa" w:w="100"/>
+              <w:bottom w:type="dxa" w:w="60"/>
+              <w:right w:type="dxa" w:w="100"/>
+            </w:tcMar>
+          </w:tcPr>
+          <w:p>
+            <w:pPr>
+              <w:spacing w:after="0" w:line="276"/>
+            </w:pPr>
+            <w:r>
+              <w:rPr>
+                <w:rFonts w:ascii="Malgun Gothic" w:cs="Malgun Gothic" w:eastAsia="맑은 고딕" w:hAnsi="Malgun Gothic"/>
+                <w:b w:val="false"/>
+                <w:bCs w:val="false"/>
+                <w:sz w:val="18"/>
+                <w:szCs w:val="18"/>
+              </w:rPr>
+              <w:t xml:space="preserve">수종(최대 5종), 임령·수고·경급(평균/최저~최고), 총축적, 경영목표(벌기령·수확대상)</w:t>
+            </w:r>
+          </w:p>
+        </w:tc>
+        <w:tc>
+          <w:tcPr>
+            <w:tcW w:type="dxa" w:w="876"/>
+            <w:tcBorders>
+              <w:top w:val="single" w:color="BFC6BC" w:sz="4"/>
+              <w:left w:val="single" w:color="BFC6BC" w:sz="4"/>
+              <w:bottom w:val="single" w:color="BFC6BC" w:sz="4"/>
+              <w:right w:val="single" w:color="BFC6BC" w:sz="4"/>
+            </w:tcBorders>
+            <w:tcMar>
+              <w:top w:type="dxa" w:w="60"/>
+              <w:left w:type="dxa" w:w="100"/>
+              <w:bottom w:type="dxa" w:w="60"/>
+              <w:right w:type="dxa" w:w="100"/>
+            </w:tcMar>
+          </w:tcPr>
+          <w:p>
+            <w:pPr>
+              <w:spacing w:after="0" w:line="276"/>
+            </w:pPr>
+            <w:r>
+              <w:rPr>
+                <w:rFonts w:ascii="Malgun Gothic" w:cs="Malgun Gothic" w:eastAsia="맑은 고딕" w:hAnsi="Malgun Gothic"/>
+                <w:b w:val="false"/>
+                <w:bCs w:val="false"/>
+                <w:sz w:val="18"/>
+                <w:szCs w:val="18"/>
+              </w:rPr>
+              <w:t xml:space="preserve">2차</w:t>
+            </w:r>
+          </w:p>
+        </w:tc>
+      </w:tr>
+      <w:tr>
+        <w:trPr>
+          <w:tblHeader w:val="false"/>
+        </w:trPr>
+        <w:tc>
+          <w:tcPr>
+            <w:tcW w:type="dxa" w:w="876"/>
+            <w:tcBorders>
+              <w:top w:val="single" w:color="BFC6BC" w:sz="4"/>
+              <w:left w:val="single" w:color="BFC6BC" w:sz="4"/>
+              <w:bottom w:val="single" w:color="BFC6BC" w:sz="4"/>
+              <w:right w:val="single" w:color="BFC6BC" w:sz="4"/>
+            </w:tcBorders>
+            <w:tcMar>
+              <w:top w:type="dxa" w:w="60"/>
+              <w:left w:type="dxa" w:w="100"/>
+              <w:bottom w:type="dxa" w:w="60"/>
+              <w:right w:type="dxa" w:w="100"/>
+            </w:tcMar>
+          </w:tcPr>
+          <w:p>
+            <w:pPr>
+              <w:spacing w:after="0" w:line="276"/>
+            </w:pPr>
+            <w:r>
+              <w:rPr>
+                <w:rFonts w:ascii="Malgun Gothic" w:cs="Malgun Gothic" w:eastAsia="맑은 고딕" w:hAnsi="Malgun Gothic"/>
+                <w:b w:val="false"/>
+                <w:bCs w:val="false"/>
+                <w:sz w:val="18"/>
+                <w:szCs w:val="18"/>
+              </w:rPr>
+              <w:t xml:space="preserve">실행실적</w:t>
+            </w:r>
+          </w:p>
+        </w:tc>
+        <w:tc>
+          <w:tcPr>
+            <w:tcW w:type="dxa" w:w="7886"/>
+            <w:tcBorders>
+              <w:top w:val="single" w:color="BFC6BC" w:sz="4"/>
+              <w:left w:val="single" w:color="BFC6BC" w:sz="4"/>
+              <w:bottom w:val="single" w:color="BFC6BC" w:sz="4"/>
+              <w:right w:val="single" w:color="BFC6BC" w:sz="4"/>
+            </w:tcBorders>
+            <w:tcMar>
+              <w:top w:type="dxa" w:w="60"/>
+              <w:left w:type="dxa" w:w="100"/>
+              <w:bottom w:type="dxa" w:w="60"/>
+              <w:right w:type="dxa" w:w="100"/>
+            </w:tcMar>
+          </w:tcPr>
+          <w:p>
+            <w:pPr>
+              <w:spacing w:after="0" w:line="276"/>
+            </w:pPr>
+            <w:r>
+              <w:rPr>
+                <w:rFonts w:ascii="Malgun Gothic" w:cs="Malgun Gothic" w:eastAsia="맑은 고딕" w:hAnsi="Malgun Gothic"/>
+                <w:b w:val="false"/>
+                <w:bCs w:val="false"/>
+                <w:sz w:val="18"/>
+                <w:szCs w:val="18"/>
+              </w:rPr>
+              <w:t xml:space="preserve">조림(연도·수종·면적·본수·조림사유), 숲가꾸기(연도·종별·면적)</w:t>
+            </w:r>
+          </w:p>
+        </w:tc>
+        <w:tc>
+          <w:tcPr>
+            <w:tcW w:type="dxa" w:w="876"/>
+            <w:tcBorders>
+              <w:top w:val="single" w:color="BFC6BC" w:sz="4"/>
+              <w:left w:val="single" w:color="BFC6BC" w:sz="4"/>
+              <w:bottom w:val="single" w:color="BFC6BC" w:sz="4"/>
+              <w:right w:val="single" w:color="BFC6BC" w:sz="4"/>
+            </w:tcBorders>
+            <w:tcMar>
+              <w:top w:type="dxa" w:w="60"/>
+              <w:left w:type="dxa" w:w="100"/>
+              <w:bottom w:type="dxa" w:w="60"/>
+              <w:right w:type="dxa" w:w="100"/>
+            </w:tcMar>
+          </w:tcPr>
+          <w:p>
+            <w:pPr>
+              <w:spacing w:after="0" w:line="276"/>
+            </w:pPr>
+            <w:r>
+              <w:rPr>
+                <w:rFonts w:ascii="Malgun Gothic" w:cs="Malgun Gothic" w:eastAsia="맑은 고딕" w:hAnsi="Malgun Gothic"/>
+                <w:b w:val="false"/>
+                <w:bCs w:val="false"/>
+                <w:sz w:val="18"/>
+                <w:szCs w:val="18"/>
+              </w:rPr>
+              <w:t xml:space="preserve">2차</w:t>
+            </w:r>
+          </w:p>
+        </w:tc>
+      </w:tr>
+      <w:tr>
+        <w:trPr>
+          <w:tblHeader w:val="false"/>
+        </w:trPr>
+        <w:tc>
+          <w:tcPr>
+            <w:tcW w:type="dxa" w:w="876"/>
+            <w:tcBorders>
+              <w:top w:val="single" w:color="BFC6BC" w:sz="4"/>
+              <w:left w:val="single" w:color="BFC6BC" w:sz="4"/>
+              <w:bottom w:val="single" w:color="BFC6BC" w:sz="4"/>
+              <w:right w:val="single" w:color="BFC6BC" w:sz="4"/>
+            </w:tcBorders>
+            <w:tcMar>
+              <w:top w:type="dxa" w:w="60"/>
+              <w:left w:type="dxa" w:w="100"/>
+              <w:bottom w:type="dxa" w:w="60"/>
+              <w:right w:type="dxa" w:w="100"/>
+            </w:tcMar>
+          </w:tcPr>
+          <w:p>
+            <w:pPr>
+              <w:spacing w:after="0" w:line="276"/>
+            </w:pPr>
+            <w:r>
+              <w:rPr>
+                <w:rFonts w:ascii="Malgun Gothic" w:cs="Malgun Gothic" w:eastAsia="맑은 고딕" w:hAnsi="Malgun Gothic"/>
+                <w:b w:val="false"/>
+                <w:bCs w:val="false"/>
+                <w:sz w:val="18"/>
+                <w:szCs w:val="18"/>
+              </w:rPr>
+              <w:t xml:space="preserve">시설</w:t>
+            </w:r>
+          </w:p>
+        </w:tc>
+        <w:tc>
+          <w:tcPr>
+            <w:tcW w:type="dxa" w:w="7886"/>
+            <w:tcBorders>
+              <w:top w:val="single" w:color="BFC6BC" w:sz="4"/>
+              <w:left w:val="single" w:color="BFC6BC" w:sz="4"/>
+              <w:bottom w:val="single" w:color="BFC6BC" w:sz="4"/>
+              <w:right w:val="single" w:color="BFC6BC" w:sz="4"/>
+            </w:tcBorders>
+            <w:tcMar>
+              <w:top w:type="dxa" w:w="60"/>
+              <w:left w:type="dxa" w:w="100"/>
+              <w:bottom w:type="dxa" w:w="60"/>
+              <w:right w:type="dxa" w:w="100"/>
+            </w:tcMar>
+          </w:tcPr>
+          <w:p>
+            <w:pPr>
+              <w:spacing w:after="0" w:line="276"/>
+            </w:pPr>
+            <w:r>
+              <w:rPr>
+                <w:rFonts w:ascii="Malgun Gothic" w:cs="Malgun Gothic" w:eastAsia="맑은 고딕" w:hAnsi="Malgun Gothic"/>
+                <w:b w:val="false"/>
+                <w:bCs w:val="false"/>
+                <w:sz w:val="18"/>
+                <w:szCs w:val="18"/>
+              </w:rPr>
+              <w:t xml:space="preserve">임도·운재로·작업로의 개소수, 사업량(km), 연도. 임도 노선 SHP</w:t>
+            </w:r>
+          </w:p>
+        </w:tc>
+        <w:tc>
+          <w:tcPr>
+            <w:tcW w:type="dxa" w:w="876"/>
+            <w:tcBorders>
+              <w:top w:val="single" w:color="BFC6BC" w:sz="4"/>
+              <w:left w:val="single" w:color="BFC6BC" w:sz="4"/>
+              <w:bottom w:val="single" w:color="BFC6BC" w:sz="4"/>
+              <w:right w:val="single" w:color="BFC6BC" w:sz="4"/>
+            </w:tcBorders>
+            <w:tcMar>
+              <w:top w:type="dxa" w:w="60"/>
+              <w:left w:type="dxa" w:w="100"/>
+              <w:bottom w:type="dxa" w:w="60"/>
+              <w:right w:type="dxa" w:w="100"/>
+            </w:tcMar>
+          </w:tcPr>
+          <w:p>
+            <w:pPr>
+              <w:spacing w:after="0" w:line="276"/>
+            </w:pPr>
+            <w:r>
+              <w:rPr>
+                <w:rFonts w:ascii="Malgun Gothic" w:cs="Malgun Gothic" w:eastAsia="맑은 고딕" w:hAnsi="Malgun Gothic"/>
+                <w:b w:val="false"/>
+                <w:bCs w:val="false"/>
+                <w:sz w:val="18"/>
+                <w:szCs w:val="18"/>
+              </w:rPr>
+              <w:t xml:space="preserve">2차</w:t>
+            </w:r>
+          </w:p>
+        </w:tc>
+      </w:tr>
+      <w:tr>
+        <w:trPr>
+          <w:tblHeader w:val="false"/>
+        </w:trPr>
+        <w:tc>
+          <w:tcPr>
+            <w:tcW w:type="dxa" w:w="876"/>
+            <w:tcBorders>
+              <w:top w:val="single" w:color="BFC6BC" w:sz="4"/>
+              <w:left w:val="single" w:color="BFC6BC" w:sz="4"/>
+              <w:bottom w:val="single" w:color="BFC6BC" w:sz="4"/>
+              <w:right w:val="single" w:color="BFC6BC" w:sz="4"/>
+            </w:tcBorders>
+            <w:tcMar>
+              <w:top w:type="dxa" w:w="60"/>
+              <w:left w:type="dxa" w:w="100"/>
+              <w:bottom w:type="dxa" w:w="60"/>
+              <w:right w:type="dxa" w:w="100"/>
+            </w:tcMar>
+          </w:tcPr>
+          <w:p>
+            <w:pPr>
+              <w:spacing w:after="0" w:line="276"/>
+            </w:pPr>
+            <w:r>
+              <w:rPr>
+                <w:rFonts w:ascii="Malgun Gothic" w:cs="Malgun Gothic" w:eastAsia="맑은 고딕" w:hAnsi="Malgun Gothic"/>
+                <w:b w:val="false"/>
+                <w:bCs w:val="false"/>
+                <w:sz w:val="18"/>
+                <w:szCs w:val="18"/>
+              </w:rPr>
+              <w:t xml:space="preserve">재해·복구</w:t>
+            </w:r>
+          </w:p>
+        </w:tc>
+        <w:tc>
+          <w:tcPr>
+            <w:tcW w:type="dxa" w:w="7886"/>
+            <w:tcBorders>
+              <w:top w:val="single" w:color="BFC6BC" w:sz="4"/>
+              <w:left w:val="single" w:color="BFC6BC" w:sz="4"/>
+              <w:bottom w:val="single" w:color="BFC6BC" w:sz="4"/>
+              <w:right w:val="single" w:color="BFC6BC" w:sz="4"/>
+            </w:tcBorders>
+            <w:tcMar>
+              <w:top w:type="dxa" w:w="60"/>
+              <w:left w:type="dxa" w:w="100"/>
+              <w:bottom w:type="dxa" w:w="60"/>
+              <w:right w:type="dxa" w:w="100"/>
+            </w:tcMar>
+          </w:tcPr>
+          <w:p>
+            <w:pPr>
+              <w:spacing w:after="0" w:line="276"/>
+            </w:pPr>
+            <w:r>
+              <w:rPr>
+                <w:rFonts w:ascii="Malgun Gothic" w:cs="Malgun Gothic" w:eastAsia="맑은 고딕" w:hAnsi="Malgun Gothic"/>
+                <w:b w:val="false"/>
+                <w:bCs w:val="false"/>
+                <w:sz w:val="18"/>
+                <w:szCs w:val="18"/>
+              </w:rPr>
+              <w:t xml:space="preserve">산사태 발생 이력(연도·위치·면적), 산지사방사업 시행 이력, 산불·병해충 피해 이력</w:t>
+            </w:r>
+          </w:p>
+        </w:tc>
+        <w:tc>
+          <w:tcPr>
+            <w:tcW w:type="dxa" w:w="876"/>
+            <w:tcBorders>
+              <w:top w:val="single" w:color="BFC6BC" w:sz="4"/>
+              <w:left w:val="single" w:color="BFC6BC" w:sz="4"/>
+              <w:bottom w:val="single" w:color="BFC6BC" w:sz="4"/>
+              <w:right w:val="single" w:color="BFC6BC" w:sz="4"/>
+            </w:tcBorders>
+            <w:tcMar>
+              <w:top w:type="dxa" w:w="60"/>
+              <w:left w:type="dxa" w:w="100"/>
+              <w:bottom w:type="dxa" w:w="60"/>
+              <w:right w:type="dxa" w:w="100"/>
+            </w:tcMar>
+          </w:tcPr>
+          <w:p>
+            <w:pPr>
+              <w:spacing w:after="0" w:line="276"/>
+            </w:pPr>
+            <w:r>
+              <w:rPr>
+                <w:rFonts w:ascii="Malgun Gothic" w:cs="Malgun Gothic" w:eastAsia="맑은 고딕" w:hAnsi="Malgun Gothic"/>
+                <w:b w:val="false"/>
+                <w:bCs w:val="false"/>
+                <w:sz w:val="18"/>
+                <w:szCs w:val="18"/>
+              </w:rPr>
+              <w:t xml:space="preserve">2차</w:t>
+            </w:r>
+          </w:p>
+        </w:tc>
+      </w:tr>
+    </w:tbl>
+    <w:p>
+      <w:pPr>
+        <w:spacing w:after="60"/>
+      </w:pPr>
     </w:p>
     <w:p>
       <w:pPr>
@@ -977,8 +2070,11 @@
           <w:rFonts w:ascii="Malgun Gothic" w:cs="Malgun Gothic" w:eastAsia="맑은 고딕" w:hAnsi="Malgun Gothic"/>
           <w:b w:val="false"/>
           <w:bCs w:val="false"/>
-        </w:rPr>
-        <w:t xml:space="preserve">정보공개포털(open.go.kr)로 기관별 청구 → 10일 이내 결정(최대 10일 연장) → 10월 말~11월 초 1차 수령 → 관리소 선정 후 2차 청구 → 11월 말 사례지 확정.</w:t>
+          <w:color w:val="5D685F"/>
+          <w:sz w:val="18"/>
+          <w:szCs w:val="18"/>
+        </w:rPr>
+        <w:t xml:space="preserve">공통 조건: 보유 기간 전체, 전자파일(엑셀·SHP). 매수자 상호·계약금액·개인정보·소득사업은 제외. 토양은 기재요령 항목에 없어 산림입지토양도로 보완함.</w:t>
       </w:r>
     </w:p>
     <w:p>
@@ -1009,7 +2105,7 @@
           <w:b/>
           <w:bCs/>
         </w:rPr>
-        <w:t xml:space="preserve">청구 범위</w:t>
+        <w:t xml:space="preserve">집재 방법</w:t>
       </w:r>
       <w:r>
         <w:rPr>
@@ -1017,7 +2113,7 @@
           <w:b w:val="false"/>
           <w:bCs w:val="false"/>
         </w:rPr>
-        <w:t xml:space="preserve">: 1차에 두 지방청 전체 목록을 받고 2차에 관리소를 좁히는 방식이 적절한지</w:t>
+        <w:t xml:space="preserve">: 기재요령에 집재 방법 항목이 없음. 입목 매각 설계서나 벌채 허가 자료에 기록되는지 확인해 청구 항목에 넣을지</w:t>
       </w:r>
     </w:p>
     <w:p>
@@ -1035,7 +2131,7 @@
           <w:b/>
           <w:bCs/>
         </w:rPr>
-        <w:t xml:space="preserve">청구 기간</w:t>
+        <w:t xml:space="preserve">산사태·사방사업 이력</w:t>
       </w:r>
       <w:r>
         <w:rPr>
@@ -1043,7 +2139,7 @@
           <w:b w:val="false"/>
           <w:bCs w:val="false"/>
         </w:rPr>
-        <w:t xml:space="preserve">: 보유 기간 전체로 할지, 1980~2024년 등으로 한정할지</w:t>
+        <w:t xml:space="preserve">: 지방청에 청구할지, 산림청 또는 지자체 자료로 따로 확보할지</w:t>
       </w:r>
     </w:p>
     <w:p>
@@ -1061,7 +2157,7 @@
           <w:b/>
           <w:bCs/>
         </w:rPr>
-        <w:t xml:space="preserve">항목</w:t>
+        <w:t xml:space="preserve">청구 기간</w:t>
       </w:r>
       <w:r>
         <w:rPr>
@@ -1069,7 +2165,7 @@
           <w:b w:val="false"/>
           <w:bCs w:val="false"/>
         </w:rPr>
-        <w:t xml:space="preserve">: 빼거나 더할 항목이 있는지(특히 집재 방법이 기록에 남아 있을지)</w:t>
+        <w:t xml:space="preserve">: 보유 기간 전체로 할지, 1980~2024년 등으로 한정할지</w:t>
       </w:r>
     </w:p>
     <w:sectPr>
@@ -1327,7 +2423,7 @@
     </w:lvlOverride>
   </w:num>
   <w:num w:numId="2">
-    <w:abstractNumId w:val="3"/>
+    <w:abstractNumId w:val="2"/>
     <w:lvlOverride w:ilvl="0">
       <w:startOverride w:val="1"/>
     </w:lvlOverride>

</xml_diff>